<commit_message>
docs(spec): đồng bộ bộ đặc tả theo plan/16 sau D118–D119
- Cập nhật 00–08 theo bản Approved v2.1 (09/10/2026): toàn bộ nghiệp vụ AI
  nằm trong AI service, Backend chỉ gọi; STT chạy Cloud Run; hợp đồng sources.
- Bỏ 09. Sprint Plan và 10. Jira Backlog (tài liệu kế hoạch/task Jira).
- Đánh lại số: Task Cards 11→09, Data Dictionary 12→10, UI Screen Spec 13→11.
- Thêm docs/README.md: bảng đối chiếu số mới ↔ số gốc trong plan/16.
</commit_message>
<xml_diff>
--- a/docs/00. Document Index.docx
+++ b/docs/00. Document Index.docx
@@ -16,7 +16,7 @@
         <w:pStyle w:val="FirstParagraph"/>
       </w:pPr>
       <w:r>
-        <w:t xml:space="preserve">Trạng thái: Approved for implementation (v2.0), cập nhật 07/10/2026 theo Bộ tiêu chí đánh giá Context implement (quyết định D103–D115).</w:t>
+        <w:t xml:space="preserve">Trạng thái: Approved for implementation (v2.1), cập nhật 09/10/2026 theo D118–D119 (ranh giới AI service, STT trên Cloud Run); trước đó 07/10/2026 theo Bộ tiêu chí đánh giá Context implement (D103–D115).</w:t>
       </w:r>
     </w:p>
     <w:bookmarkStart w:id="9" w:name="X9de8507468bc91cbe7f8ae1fcf841f9ffbf4501"/>
@@ -43,10 +43,10 @@
         <w:tblLayout w:type="fixed"/>
       </w:tblPr>
       <w:tblGrid>
-        <w:gridCol w:w="893"/>
-        <w:gridCol w:w="5167"/>
-        <w:gridCol w:w="1550"/>
-        <w:gridCol w:w="6337"/>
+        <w:gridCol w:w="890"/>
+        <w:gridCol w:w="4881"/>
+        <w:gridCol w:w="1465"/>
+        <w:gridCol w:w="6712"/>
       </w:tblGrid>
       <w:tr>
         <w:trPr>
@@ -55,7 +55,7 @@
         </w:trPr>
         <w:tc>
           <w:tcPr>
-            <w:tcW w:w="893" w:type="dxa"/>
+            <w:tcW w:w="890" w:type="dxa"/>
           </w:tcPr>
           <w:p>
             <w:pPr>
@@ -76,7 +76,7 @@
         </w:tc>
         <w:tc>
           <w:tcPr>
-            <w:tcW w:w="5167" w:type="dxa"/>
+            <w:tcW w:w="4881" w:type="dxa"/>
           </w:tcPr>
           <w:p>
             <w:pPr>
@@ -97,7 +97,7 @@
         </w:tc>
         <w:tc>
           <w:tcPr>
-            <w:tcW w:w="1550" w:type="dxa"/>
+            <w:tcW w:w="1465" w:type="dxa"/>
           </w:tcPr>
           <w:p>
             <w:pPr>
@@ -118,7 +118,7 @@
         </w:tc>
         <w:tc>
           <w:tcPr>
-            <w:tcW w:w="6337" w:type="dxa"/>
+            <w:tcW w:w="6712" w:type="dxa"/>
           </w:tcPr>
           <w:p>
             <w:pPr>
@@ -144,7 +144,7 @@
         </w:trPr>
         <w:tc>
           <w:tcPr>
-            <w:tcW w:w="893" w:type="dxa"/>
+            <w:tcW w:w="890" w:type="dxa"/>
           </w:tcPr>
           <w:p>
             <w:pPr>
@@ -164,7 +164,7 @@
         </w:tc>
         <w:tc>
           <w:tcPr>
-            <w:tcW w:w="5167" w:type="dxa"/>
+            <w:tcW w:w="4881" w:type="dxa"/>
           </w:tcPr>
           <w:p>
             <w:pPr>
@@ -184,7 +184,7 @@
         </w:tc>
         <w:tc>
           <w:tcPr>
-            <w:tcW w:w="1550" w:type="dxa"/>
+            <w:tcW w:w="1465" w:type="dxa"/>
           </w:tcPr>
           <w:p>
             <w:pPr>
@@ -204,7 +204,7 @@
         </w:tc>
         <w:tc>
           <w:tcPr>
-            <w:tcW w:w="6337" w:type="dxa"/>
+            <w:tcW w:w="6712" w:type="dxa"/>
           </w:tcPr>
           <w:p>
             <w:pPr>
@@ -229,7 +229,7 @@
         </w:trPr>
         <w:tc>
           <w:tcPr>
-            <w:tcW w:w="893" w:type="dxa"/>
+            <w:tcW w:w="890" w:type="dxa"/>
           </w:tcPr>
           <w:p>
             <w:pPr>
@@ -249,7 +249,7 @@
         </w:tc>
         <w:tc>
           <w:tcPr>
-            <w:tcW w:w="5167" w:type="dxa"/>
+            <w:tcW w:w="4881" w:type="dxa"/>
           </w:tcPr>
           <w:p>
             <w:pPr>
@@ -269,7 +269,7 @@
         </w:tc>
         <w:tc>
           <w:tcPr>
-            <w:tcW w:w="1550" w:type="dxa"/>
+            <w:tcW w:w="1465" w:type="dxa"/>
           </w:tcPr>
           <w:p>
             <w:pPr>
@@ -289,7 +289,7 @@
         </w:tc>
         <w:tc>
           <w:tcPr>
-            <w:tcW w:w="6337" w:type="dxa"/>
+            <w:tcW w:w="6712" w:type="dxa"/>
           </w:tcPr>
           <w:p>
             <w:pPr>
@@ -314,7 +314,7 @@
         </w:trPr>
         <w:tc>
           <w:tcPr>
-            <w:tcW w:w="893" w:type="dxa"/>
+            <w:tcW w:w="890" w:type="dxa"/>
           </w:tcPr>
           <w:p>
             <w:pPr>
@@ -334,7 +334,7 @@
         </w:tc>
         <w:tc>
           <w:tcPr>
-            <w:tcW w:w="5167" w:type="dxa"/>
+            <w:tcW w:w="4881" w:type="dxa"/>
           </w:tcPr>
           <w:p>
             <w:pPr>
@@ -354,7 +354,7 @@
         </w:tc>
         <w:tc>
           <w:tcPr>
-            <w:tcW w:w="1550" w:type="dxa"/>
+            <w:tcW w:w="1465" w:type="dxa"/>
           </w:tcPr>
           <w:p>
             <w:pPr>
@@ -374,7 +374,7 @@
         </w:tc>
         <w:tc>
           <w:tcPr>
-            <w:tcW w:w="6337" w:type="dxa"/>
+            <w:tcW w:w="6712" w:type="dxa"/>
           </w:tcPr>
           <w:p>
             <w:pPr>
@@ -399,7 +399,7 @@
         </w:trPr>
         <w:tc>
           <w:tcPr>
-            <w:tcW w:w="893" w:type="dxa"/>
+            <w:tcW w:w="890" w:type="dxa"/>
           </w:tcPr>
           <w:p>
             <w:pPr>
@@ -419,7 +419,7 @@
         </w:tc>
         <w:tc>
           <w:tcPr>
-            <w:tcW w:w="5167" w:type="dxa"/>
+            <w:tcW w:w="4881" w:type="dxa"/>
           </w:tcPr>
           <w:p>
             <w:pPr>
@@ -439,7 +439,7 @@
         </w:tc>
         <w:tc>
           <w:tcPr>
-            <w:tcW w:w="1550" w:type="dxa"/>
+            <w:tcW w:w="1465" w:type="dxa"/>
           </w:tcPr>
           <w:p>
             <w:pPr>
@@ -459,7 +459,7 @@
         </w:tc>
         <w:tc>
           <w:tcPr>
-            <w:tcW w:w="6337" w:type="dxa"/>
+            <w:tcW w:w="6712" w:type="dxa"/>
           </w:tcPr>
           <w:p>
             <w:pPr>
@@ -484,7 +484,7 @@
         </w:trPr>
         <w:tc>
           <w:tcPr>
-            <w:tcW w:w="893" w:type="dxa"/>
+            <w:tcW w:w="890" w:type="dxa"/>
           </w:tcPr>
           <w:p>
             <w:pPr>
@@ -504,7 +504,7 @@
         </w:tc>
         <w:tc>
           <w:tcPr>
-            <w:tcW w:w="5167" w:type="dxa"/>
+            <w:tcW w:w="4881" w:type="dxa"/>
           </w:tcPr>
           <w:p>
             <w:pPr>
@@ -524,7 +524,7 @@
         </w:tc>
         <w:tc>
           <w:tcPr>
-            <w:tcW w:w="1550" w:type="dxa"/>
+            <w:tcW w:w="1465" w:type="dxa"/>
           </w:tcPr>
           <w:p>
             <w:pPr>
@@ -544,7 +544,7 @@
         </w:tc>
         <w:tc>
           <w:tcPr>
-            <w:tcW w:w="6337" w:type="dxa"/>
+            <w:tcW w:w="6712" w:type="dxa"/>
           </w:tcPr>
           <w:p>
             <w:pPr>
@@ -569,7 +569,7 @@
         </w:trPr>
         <w:tc>
           <w:tcPr>
-            <w:tcW w:w="893" w:type="dxa"/>
+            <w:tcW w:w="890" w:type="dxa"/>
           </w:tcPr>
           <w:p>
             <w:pPr>
@@ -589,7 +589,7 @@
         </w:tc>
         <w:tc>
           <w:tcPr>
-            <w:tcW w:w="5167" w:type="dxa"/>
+            <w:tcW w:w="4881" w:type="dxa"/>
           </w:tcPr>
           <w:p>
             <w:pPr>
@@ -609,7 +609,7 @@
         </w:tc>
         <w:tc>
           <w:tcPr>
-            <w:tcW w:w="1550" w:type="dxa"/>
+            <w:tcW w:w="1465" w:type="dxa"/>
           </w:tcPr>
           <w:p>
             <w:pPr>
@@ -629,21 +629,21 @@
         </w:tc>
         <w:tc>
           <w:tcPr>
-            <w:tcW w:w="6337" w:type="dxa"/>
-          </w:tcPr>
-          <w:p>
-            <w:pPr>
-              <w:pStyle w:val="Compact"/>
-              <w:spacing w:before="30" w:after="30" w:line="269" w:lineRule="auto"/>
-              <w:jc w:val="left"/>
-            </w:pPr>
-            <w:r>
-              <w:rPr>
-                <w:rFonts w:ascii="Times New Roman" w:hAnsi="Times New Roman"/>
-                <w:color w:val="000000"/>
-                <w:sz w:val="20"/>
-              </w:rPr>
-              <w:t xml:space="preserve">Kiến trúc có Qdrant, đối chiếu Context Diagram và danh mục công nghệ, quy tắc Tailwind + Bootstrap, luồng dữ liệu, môi trường, Docker Compose, CI/CD</w:t>
+            <w:tcW w:w="6712" w:type="dxa"/>
+          </w:tcPr>
+          <w:p>
+            <w:pPr>
+              <w:pStyle w:val="Compact"/>
+              <w:spacing w:before="30" w:after="30" w:line="269" w:lineRule="auto"/>
+              <w:jc w:val="left"/>
+            </w:pPr>
+            <w:r>
+              <w:rPr>
+                <w:rFonts w:ascii="Times New Roman" w:hAnsi="Times New Roman"/>
+                <w:color w:val="000000"/>
+                <w:sz w:val="20"/>
+              </w:rPr>
+              <w:t xml:space="preserve">Kiến trúc có Qdrant; AI service giữ toàn bộ nghiệp vụ AI, Backend chỉ gọi (D118); đối chiếu Context Diagram và danh mục công nghệ, quy tắc Tailwind + Bootstrap, luồng dữ liệu, môi trường, Docker Compose, CI/CD</w:t>
             </w:r>
           </w:p>
         </w:tc>
@@ -654,7 +654,7 @@
         </w:trPr>
         <w:tc>
           <w:tcPr>
-            <w:tcW w:w="893" w:type="dxa"/>
+            <w:tcW w:w="890" w:type="dxa"/>
           </w:tcPr>
           <w:p>
             <w:pPr>
@@ -674,7 +674,7 @@
         </w:tc>
         <w:tc>
           <w:tcPr>
-            <w:tcW w:w="5167" w:type="dxa"/>
+            <w:tcW w:w="4881" w:type="dxa"/>
           </w:tcPr>
           <w:p>
             <w:pPr>
@@ -694,7 +694,7 @@
         </w:tc>
         <w:tc>
           <w:tcPr>
-            <w:tcW w:w="1550" w:type="dxa"/>
+            <w:tcW w:w="1465" w:type="dxa"/>
           </w:tcPr>
           <w:p>
             <w:pPr>
@@ -714,7 +714,7 @@
         </w:tc>
         <w:tc>
           <w:tcPr>
-            <w:tcW w:w="6337" w:type="dxa"/>
+            <w:tcW w:w="6712" w:type="dxa"/>
           </w:tcPr>
           <w:p>
             <w:pPr>
@@ -739,7 +739,7 @@
         </w:trPr>
         <w:tc>
           <w:tcPr>
-            <w:tcW w:w="893" w:type="dxa"/>
+            <w:tcW w:w="890" w:type="dxa"/>
           </w:tcPr>
           <w:p>
             <w:pPr>
@@ -759,7 +759,7 @@
         </w:tc>
         <w:tc>
           <w:tcPr>
-            <w:tcW w:w="5167" w:type="dxa"/>
+            <w:tcW w:w="4881" w:type="dxa"/>
           </w:tcPr>
           <w:p>
             <w:pPr>
@@ -779,7 +779,7 @@
         </w:tc>
         <w:tc>
           <w:tcPr>
-            <w:tcW w:w="1550" w:type="dxa"/>
+            <w:tcW w:w="1465" w:type="dxa"/>
           </w:tcPr>
           <w:p>
             <w:pPr>
@@ -799,7 +799,7 @@
         </w:tc>
         <w:tc>
           <w:tcPr>
-            <w:tcW w:w="6337" w:type="dxa"/>
+            <w:tcW w:w="6712" w:type="dxa"/>
           </w:tcPr>
           <w:p>
             <w:pPr>
@@ -824,7 +824,7 @@
         </w:trPr>
         <w:tc>
           <w:tcPr>
-            <w:tcW w:w="893" w:type="dxa"/>
+            <w:tcW w:w="890" w:type="dxa"/>
           </w:tcPr>
           <w:p>
             <w:pPr>
@@ -844,7 +844,7 @@
         </w:tc>
         <w:tc>
           <w:tcPr>
-            <w:tcW w:w="5167" w:type="dxa"/>
+            <w:tcW w:w="4881" w:type="dxa"/>
           </w:tcPr>
           <w:p>
             <w:pPr>
@@ -864,7 +864,7 @@
         </w:tc>
         <w:tc>
           <w:tcPr>
-            <w:tcW w:w="1550" w:type="dxa"/>
+            <w:tcW w:w="1465" w:type="dxa"/>
           </w:tcPr>
           <w:p>
             <w:pPr>
@@ -884,7 +884,7 @@
         </w:tc>
         <w:tc>
           <w:tcPr>
-            <w:tcW w:w="6337" w:type="dxa"/>
+            <w:tcW w:w="6712" w:type="dxa"/>
           </w:tcPr>
           <w:p>
             <w:pPr>
@@ -909,7 +909,7 @@
         </w:trPr>
         <w:tc>
           <w:tcPr>
-            <w:tcW w:w="893" w:type="dxa"/>
+            <w:tcW w:w="890" w:type="dxa"/>
           </w:tcPr>
           <w:p>
             <w:pPr>
@@ -929,7 +929,7 @@
         </w:tc>
         <w:tc>
           <w:tcPr>
-            <w:tcW w:w="5167" w:type="dxa"/>
+            <w:tcW w:w="4881" w:type="dxa"/>
           </w:tcPr>
           <w:p>
             <w:pPr>
@@ -949,7 +949,7 @@
         </w:tc>
         <w:tc>
           <w:tcPr>
-            <w:tcW w:w="1550" w:type="dxa"/>
+            <w:tcW w:w="1465" w:type="dxa"/>
           </w:tcPr>
           <w:p>
             <w:pPr>
@@ -969,7 +969,7 @@
         </w:tc>
         <w:tc>
           <w:tcPr>
-            <w:tcW w:w="6337" w:type="dxa"/>
+            <w:tcW w:w="6712" w:type="dxa"/>
           </w:tcPr>
           <w:p>
             <w:pPr>
@@ -994,7 +994,7 @@
         </w:trPr>
         <w:tc>
           <w:tcPr>
-            <w:tcW w:w="893" w:type="dxa"/>
+            <w:tcW w:w="890" w:type="dxa"/>
           </w:tcPr>
           <w:p>
             <w:pPr>
@@ -1014,7 +1014,7 @@
         </w:tc>
         <w:tc>
           <w:tcPr>
-            <w:tcW w:w="5167" w:type="dxa"/>
+            <w:tcW w:w="4881" w:type="dxa"/>
           </w:tcPr>
           <w:p>
             <w:pPr>
@@ -1034,7 +1034,7 @@
         </w:tc>
         <w:tc>
           <w:tcPr>
-            <w:tcW w:w="1550" w:type="dxa"/>
+            <w:tcW w:w="1465" w:type="dxa"/>
           </w:tcPr>
           <w:p>
             <w:pPr>
@@ -1054,7 +1054,7 @@
         </w:tc>
         <w:tc>
           <w:tcPr>
-            <w:tcW w:w="6337" w:type="dxa"/>
+            <w:tcW w:w="6712" w:type="dxa"/>
           </w:tcPr>
           <w:p>
             <w:pPr>
@@ -1079,7 +1079,7 @@
         </w:trPr>
         <w:tc>
           <w:tcPr>
-            <w:tcW w:w="893" w:type="dxa"/>
+            <w:tcW w:w="890" w:type="dxa"/>
           </w:tcPr>
           <w:p>
             <w:pPr>
@@ -1099,7 +1099,7 @@
         </w:tc>
         <w:tc>
           <w:tcPr>
-            <w:tcW w:w="5167" w:type="dxa"/>
+            <w:tcW w:w="4881" w:type="dxa"/>
           </w:tcPr>
           <w:p>
             <w:pPr>
@@ -1119,7 +1119,7 @@
         </w:tc>
         <w:tc>
           <w:tcPr>
-            <w:tcW w:w="1550" w:type="dxa"/>
+            <w:tcW w:w="1465" w:type="dxa"/>
           </w:tcPr>
           <w:p>
             <w:pPr>
@@ -1139,7 +1139,7 @@
         </w:tc>
         <w:tc>
           <w:tcPr>
-            <w:tcW w:w="6337" w:type="dxa"/>
+            <w:tcW w:w="6712" w:type="dxa"/>
           </w:tcPr>
           <w:p>
             <w:pPr>
@@ -1164,7 +1164,7 @@
         </w:trPr>
         <w:tc>
           <w:tcPr>
-            <w:tcW w:w="893" w:type="dxa"/>
+            <w:tcW w:w="890" w:type="dxa"/>
           </w:tcPr>
           <w:p>
             <w:pPr>
@@ -1184,7 +1184,7 @@
         </w:tc>
         <w:tc>
           <w:tcPr>
-            <w:tcW w:w="5167" w:type="dxa"/>
+            <w:tcW w:w="4881" w:type="dxa"/>
           </w:tcPr>
           <w:p>
             <w:pPr>
@@ -1204,7 +1204,7 @@
         </w:tc>
         <w:tc>
           <w:tcPr>
-            <w:tcW w:w="1550" w:type="dxa"/>
+            <w:tcW w:w="1465" w:type="dxa"/>
           </w:tcPr>
           <w:p>
             <w:pPr>
@@ -1224,7 +1224,7 @@
         </w:tc>
         <w:tc>
           <w:tcPr>
-            <w:tcW w:w="6337" w:type="dxa"/>
+            <w:tcW w:w="6712" w:type="dxa"/>
           </w:tcPr>
           <w:p>
             <w:pPr>
@@ -1249,7 +1249,7 @@
         </w:trPr>
         <w:tc>
           <w:tcPr>
-            <w:tcW w:w="893" w:type="dxa"/>
+            <w:tcW w:w="890" w:type="dxa"/>
           </w:tcPr>
           <w:p>
             <w:pPr>
@@ -1269,7 +1269,7 @@
         </w:tc>
         <w:tc>
           <w:tcPr>
-            <w:tcW w:w="5167" w:type="dxa"/>
+            <w:tcW w:w="4881" w:type="dxa"/>
           </w:tcPr>
           <w:p>
             <w:pPr>
@@ -1289,7 +1289,7 @@
         </w:tc>
         <w:tc>
           <w:tcPr>
-            <w:tcW w:w="1550" w:type="dxa"/>
+            <w:tcW w:w="1465" w:type="dxa"/>
           </w:tcPr>
           <w:p>
             <w:pPr>
@@ -1309,7 +1309,7 @@
         </w:tc>
         <w:tc>
           <w:tcPr>
-            <w:tcW w:w="6337" w:type="dxa"/>
+            <w:tcW w:w="6712" w:type="dxa"/>
           </w:tcPr>
           <w:p>
             <w:pPr>
@@ -1338,13 +1338,13 @@
       </w:r>
     </w:p>
     <w:bookmarkEnd w:id="9"/>
-    <w:bookmarkStart w:id="10" w:name="X91f135ac180158cfbe48d2dced8044592256cb5"/>
+    <w:bookmarkStart w:id="10" w:name="X78a2dd838f5159a31d308445289313e453046d8"/>
     <w:p>
       <w:pPr>
         <w:pStyle w:val="Heading2"/>
       </w:pPr>
       <w:r>
-        <w:t xml:space="preserve">2. Quyết định chính (Decision Log D98 - D115)</w:t>
+        <w:t xml:space="preserve">2. Quyết định chính (Decision Log D98 - D119)</w:t>
       </w:r>
     </w:p>
     <w:p>
@@ -1369,6 +1369,30 @@
       </w:pPr>
       <w:r>
         <w:t xml:space="preserve">Chatbot RAG dùng Qdrant thuộc MVP; thêm FN-CHAT-07 (đồng bộ kho tri thức); AIQuotaLogs.Feature_Code thêm AI_EMBEDDING và CONTENT_MODERATION. Tổng 81 chức năng, 109 endpoint.</w:t>
+      </w:r>
+    </w:p>
+    <w:p>
+      <w:pPr>
+        <w:pStyle w:val="Compact"/>
+        <w:numPr>
+          <w:ilvl w:val="0"/>
+          <w:numId w:val="1001"/>
+        </w:numPr>
+      </w:pPr>
+      <w:r>
+        <w:t xml:space="preserve">Toàn bộ nghiệp vụ AI (RAG, chat, thực đơn, kiểm duyệt, embedding, STT, Vision) nằm trong AI service; Backend chỉ kiểm hạn mức, gửi ngữ cảnh, gọi AI service và lưu kết quả; Qdrant chỉ AI service truy cập; Qdrant hoặc AI service lỗi thì trả lỗi rõ ràng, không bỏ qua RAG (D118).</w:t>
+      </w:r>
+    </w:p>
+    <w:p>
+      <w:pPr>
+        <w:pStyle w:val="Compact"/>
+        <w:numPr>
+          <w:ilvl w:val="0"/>
+          <w:numId w:val="1001"/>
+        </w:numPr>
+      </w:pPr>
+      <w:r>
+        <w:t xml:space="preserve">Triển khai AI: stt-service (Whisper) trên Cloud Run, ai-service cùng Qdrant trên VPS, cùng repo; sources công khai giữ {type, id, title} (tài liệu dinh dưỡng có front-matter id); câu hỏi bị chặn vẫn tính lượt; test AI service thật bằng Testcontainers khi merge develop; trần 35 điểm/người/sprint (D119).</w:t>
       </w:r>
     </w:p>
     <w:p>

</xml_diff>